<commit_message>
cambios a la clase triplos analizador lexico y el frame del compilador
</commit_message>
<xml_diff>
--- a/Ejemplos de codigo de entrada.docx
+++ b/Ejemplos de codigo de entrada.docx
@@ -822,6 +822,223 @@
         </w:rPr>
         <w:t>}</w:t>
       </w:r>
+    </w:p>
+    <w:p>
+      <w:pPr>
+        <w:shd w:val="clear" w:color="auto" w:fill="FFFFFF" w:themeFill="background1"/>
+        <w:spacing w:line="240" w:lineRule="auto"/>
+        <w:rPr>
+          <w:lang w:val="en-US"/>
+        </w:rPr>
+      </w:pPr>
+    </w:p>
+    <w:p>
+      <w:pPr>
+        <w:shd w:val="clear" w:color="auto" w:fill="FFFFFF" w:themeFill="background1"/>
+        <w:spacing w:line="240" w:lineRule="auto"/>
+        <w:rPr>
+          <w:lang w:val="en-US"/>
+        </w:rPr>
+      </w:pPr>
+    </w:p>
+    <w:p>
+      <w:pPr>
+        <w:shd w:val="clear" w:color="auto" w:fill="F2F2F2" w:themeFill="background1" w:themeFillShade="F2"/>
+        <w:spacing w:line="240" w:lineRule="auto"/>
+        <w:rPr>
+          <w:lang w:val="en-US"/>
+        </w:rPr>
+      </w:pPr>
+      <w:r>
+        <w:rPr>
+          <w:lang w:val="en-US"/>
+        </w:rPr>
+        <w:t xml:space="preserve">EQ112 = </w:t>
+      </w:r>
+      <w:proofErr w:type="gramStart"/>
+      <w:r>
+        <w:rPr>
+          <w:lang w:val="en-US"/>
+        </w:rPr>
+        <w:t>10;</w:t>
+      </w:r>
+      <w:proofErr w:type="gramEnd"/>
+    </w:p>
+    <w:p>
+      <w:pPr>
+        <w:shd w:val="clear" w:color="auto" w:fill="F2F2F2" w:themeFill="background1" w:themeFillShade="F2"/>
+        <w:spacing w:line="240" w:lineRule="auto"/>
+        <w:rPr>
+          <w:lang w:val="en-US"/>
+        </w:rPr>
+      </w:pPr>
+      <w:r>
+        <w:rPr>
+          <w:lang w:val="en-US"/>
+        </w:rPr>
+        <w:t xml:space="preserve">EQ113 = </w:t>
+      </w:r>
+      <w:proofErr w:type="gramStart"/>
+      <w:r>
+        <w:rPr>
+          <w:lang w:val="en-US"/>
+        </w:rPr>
+        <w:t>EQ11;</w:t>
+      </w:r>
+      <w:proofErr w:type="gramEnd"/>
+    </w:p>
+    <w:p>
+      <w:pPr>
+        <w:shd w:val="clear" w:color="auto" w:fill="F2F2F2" w:themeFill="background1" w:themeFillShade="F2"/>
+        <w:spacing w:line="240" w:lineRule="auto"/>
+        <w:rPr>
+          <w:lang w:val="en-US"/>
+        </w:rPr>
+      </w:pPr>
+      <w:r>
+        <w:rPr>
+          <w:lang w:val="en-US"/>
+        </w:rPr>
+        <w:t xml:space="preserve">for </w:t>
+      </w:r>
+      <w:proofErr w:type="gramStart"/>
+      <w:r>
+        <w:rPr>
+          <w:lang w:val="en-US"/>
+        </w:rPr>
+        <w:t>( EQ</w:t>
+      </w:r>
+      <w:proofErr w:type="gramEnd"/>
+      <w:r>
+        <w:rPr>
+          <w:lang w:val="en-US"/>
+        </w:rPr>
+        <w:t>111 = 1; EQ111&gt;10 &amp;&amp; EQ111&lt;12;  EQ111 = EQ111 + 1;)</w:t>
+      </w:r>
+    </w:p>
+    <w:p>
+      <w:pPr>
+        <w:shd w:val="clear" w:color="auto" w:fill="F2F2F2" w:themeFill="background1" w:themeFillShade="F2"/>
+        <w:spacing w:line="240" w:lineRule="auto"/>
+        <w:rPr>
+          <w:u w:val="single"/>
+          <w:lang w:val="en-US"/>
+        </w:rPr>
+      </w:pPr>
+      <w:r>
+        <w:rPr>
+          <w:lang w:val="en-US"/>
+        </w:rPr>
+        <w:t>{</w:t>
+      </w:r>
+    </w:p>
+    <w:p>
+      <w:pPr>
+        <w:shd w:val="clear" w:color="auto" w:fill="F2F2F2" w:themeFill="background1" w:themeFillShade="F2"/>
+        <w:spacing w:line="240" w:lineRule="auto"/>
+        <w:rPr>
+          <w:lang w:val="en-US"/>
+        </w:rPr>
+      </w:pPr>
+      <w:r>
+        <w:rPr>
+          <w:lang w:val="en-US"/>
+        </w:rPr>
+        <w:t xml:space="preserve">EQ117 = EQ112 - 12 * </w:t>
+      </w:r>
+      <w:proofErr w:type="gramStart"/>
+      <w:r>
+        <w:rPr>
+          <w:lang w:val="en-US"/>
+        </w:rPr>
+        <w:t>10;</w:t>
+      </w:r>
+      <w:proofErr w:type="gramEnd"/>
+    </w:p>
+    <w:p>
+      <w:pPr>
+        <w:shd w:val="clear" w:color="auto" w:fill="F2F2F2" w:themeFill="background1" w:themeFillShade="F2"/>
+        <w:spacing w:line="240" w:lineRule="auto"/>
+        <w:rPr>
+          <w:lang w:val="en-US"/>
+        </w:rPr>
+      </w:pPr>
+      <w:r>
+        <w:rPr>
+          <w:lang w:val="en-US"/>
+        </w:rPr>
+        <w:t xml:space="preserve">EQ110 = "EQ112" - 12 / </w:t>
+      </w:r>
+      <w:proofErr w:type="gramStart"/>
+      <w:r>
+        <w:rPr>
+          <w:lang w:val="en-US"/>
+        </w:rPr>
+        <w:t>10;</w:t>
+      </w:r>
+      <w:proofErr w:type="gramEnd"/>
+    </w:p>
+    <w:p>
+      <w:pPr>
+        <w:shd w:val="clear" w:color="auto" w:fill="F2F2F2" w:themeFill="background1" w:themeFillShade="F2"/>
+        <w:spacing w:line="240" w:lineRule="auto"/>
+        <w:rPr>
+          <w:lang w:val="en-US"/>
+        </w:rPr>
+      </w:pPr>
+      <w:r>
+        <w:rPr>
+          <w:lang w:val="en-US"/>
+        </w:rPr>
+        <w:t>}</w:t>
+      </w:r>
+    </w:p>
+    <w:p>
+      <w:pPr>
+        <w:shd w:val="clear" w:color="auto" w:fill="F2F2F2" w:themeFill="background1" w:themeFillShade="F2"/>
+        <w:spacing w:line="240" w:lineRule="auto"/>
+        <w:rPr>
+          <w:lang w:val="en-US"/>
+        </w:rPr>
+      </w:pPr>
+      <w:r>
+        <w:rPr>
+          <w:lang w:val="en-US"/>
+        </w:rPr>
+        <w:t>EQ118 = EQ</w:t>
+      </w:r>
+      <w:proofErr w:type="gramStart"/>
+      <w:r>
+        <w:rPr>
+          <w:lang w:val="en-US"/>
+        </w:rPr>
+        <w:t>119  /</w:t>
+      </w:r>
+      <w:proofErr w:type="gramEnd"/>
+      <w:r>
+        <w:rPr>
+          <w:lang w:val="en-US"/>
+        </w:rPr>
+        <w:t xml:space="preserve"> 10 ;</w:t>
+      </w:r>
+    </w:p>
+    <w:p>
+      <w:pPr>
+        <w:shd w:val="clear" w:color="auto" w:fill="F2F2F2" w:themeFill="background1" w:themeFillShade="F2"/>
+        <w:spacing w:line="240" w:lineRule="auto"/>
+        <w:rPr>
+          <w:lang w:val="en-US"/>
+        </w:rPr>
+      </w:pPr>
+    </w:p>
+    <w:p>
+      <w:pPr>
+        <w:shd w:val="clear" w:color="auto" w:fill="F2F2F2" w:themeFill="background1" w:themeFillShade="F2"/>
+        <w:spacing w:line="240" w:lineRule="auto"/>
+        <w:rPr>
+          <w:lang w:val="en-US"/>
+        </w:rPr>
+      </w:pPr>
     </w:p>
     <w:sectPr>
       <w:pgSz w:w="12240" w:h="15840"/>

</xml_diff>

<commit_message>
Subiendo cambios a la rama triplos
</commit_message>
<xml_diff>
--- a/Ejemplos de codigo de entrada.docx
+++ b/Ejemplos de codigo de entrada.docx
@@ -758,7 +758,45 @@
         <w:rPr>
           <w:lang w:val="en-US"/>
         </w:rPr>
-        <w:t>for (EQ111= 1; EQ111&gt;10 &amp;&amp; EQ111&lt;15; EQ111 = EQ111 + 1;)</w:t>
+        <w:t xml:space="preserve">for </w:t>
+      </w:r>
+      <w:proofErr w:type="gramStart"/>
+      <w:r>
+        <w:rPr>
+          <w:lang w:val="en-US"/>
+        </w:rPr>
+        <w:t>(</w:t>
+      </w:r>
+      <w:r>
+        <w:rPr>
+          <w:lang w:val="en-US"/>
+        </w:rPr>
+        <w:t xml:space="preserve"> </w:t>
+      </w:r>
+      <w:r>
+        <w:rPr>
+          <w:lang w:val="en-US"/>
+        </w:rPr>
+        <w:t>EQ</w:t>
+      </w:r>
+      <w:proofErr w:type="gramEnd"/>
+      <w:r>
+        <w:rPr>
+          <w:lang w:val="en-US"/>
+        </w:rPr>
+        <w:t>111</w:t>
+      </w:r>
+      <w:r>
+        <w:rPr>
+          <w:lang w:val="en-US"/>
+        </w:rPr>
+        <w:t xml:space="preserve"> </w:t>
+      </w:r>
+      <w:r>
+        <w:rPr>
+          <w:lang w:val="en-US"/>
+        </w:rPr>
+        <w:t>= 1; EQ111&gt;10 &amp;&amp; EQ111&lt;15; EQ111 = EQ111 + 1;)</w:t>
       </w:r>
     </w:p>
     <w:p>
@@ -1034,6 +1072,1281 @@
         </w:rPr>
         <w:t xml:space="preserve"> 10 ;</w:t>
       </w:r>
+    </w:p>
+    <w:p>
+      <w:pPr>
+        <w:rPr>
+          <w:lang w:val="en-US"/>
+        </w:rPr>
+      </w:pPr>
+      <w:r>
+        <w:rPr>
+          <w:lang w:val="en-US"/>
+        </w:rPr>
+        <w:br w:type="page"/>
+      </w:r>
+    </w:p>
+    <w:p>
+      <w:pPr>
+        <w:shd w:val="clear" w:color="auto" w:fill="F2F2F2" w:themeFill="background1" w:themeFillShade="F2"/>
+        <w:spacing w:line="240" w:lineRule="auto"/>
+        <w:rPr>
+          <w:lang w:val="en-US"/>
+        </w:rPr>
+      </w:pPr>
+      <w:r>
+        <w:rPr>
+          <w:lang w:val="en-US"/>
+        </w:rPr>
+        <w:lastRenderedPageBreak/>
+        <w:t xml:space="preserve">for </w:t>
+      </w:r>
+      <w:proofErr w:type="gramStart"/>
+      <w:r>
+        <w:rPr>
+          <w:lang w:val="en-US"/>
+        </w:rPr>
+        <w:t>( EQ</w:t>
+      </w:r>
+      <w:proofErr w:type="gramEnd"/>
+      <w:r>
+        <w:rPr>
+          <w:lang w:val="en-US"/>
+        </w:rPr>
+        <w:t>111 = 1; EQ111&gt;10 &amp;&amp; EQ111&lt;12;  EQ111 = EQ111 + 1;)</w:t>
+      </w:r>
+    </w:p>
+    <w:p>
+      <w:pPr>
+        <w:shd w:val="clear" w:color="auto" w:fill="F2F2F2" w:themeFill="background1" w:themeFillShade="F2"/>
+        <w:spacing w:line="240" w:lineRule="auto"/>
+        <w:rPr>
+          <w:lang w:val="en-US"/>
+        </w:rPr>
+      </w:pPr>
+      <w:r>
+        <w:rPr>
+          <w:lang w:val="en-US"/>
+        </w:rPr>
+        <w:t>{</w:t>
+      </w:r>
+    </w:p>
+    <w:p>
+      <w:pPr>
+        <w:shd w:val="clear" w:color="auto" w:fill="F2F2F2" w:themeFill="background1" w:themeFillShade="F2"/>
+        <w:spacing w:line="240" w:lineRule="auto"/>
+        <w:rPr>
+          <w:lang w:val="en-US"/>
+        </w:rPr>
+      </w:pPr>
+      <w:r>
+        <w:rPr>
+          <w:lang w:val="en-US"/>
+        </w:rPr>
+        <w:t xml:space="preserve">EQ117 = 100 - 10 * </w:t>
+      </w:r>
+      <w:proofErr w:type="gramStart"/>
+      <w:r>
+        <w:rPr>
+          <w:lang w:val="en-US"/>
+        </w:rPr>
+        <w:t>10;</w:t>
+      </w:r>
+      <w:proofErr w:type="gramEnd"/>
+    </w:p>
+    <w:p>
+      <w:pPr>
+        <w:shd w:val="clear" w:color="auto" w:fill="F2F2F2" w:themeFill="background1" w:themeFillShade="F2"/>
+        <w:spacing w:line="240" w:lineRule="auto"/>
+        <w:rPr>
+          <w:lang w:val="en-US"/>
+        </w:rPr>
+      </w:pPr>
+      <w:r>
+        <w:rPr>
+          <w:lang w:val="en-US"/>
+        </w:rPr>
+        <w:t xml:space="preserve">EQ110 = "EQ112" + EQ11888 / </w:t>
+      </w:r>
+      <w:proofErr w:type="gramStart"/>
+      <w:r>
+        <w:rPr>
+          <w:lang w:val="en-US"/>
+        </w:rPr>
+        <w:t>100;</w:t>
+      </w:r>
+      <w:proofErr w:type="gramEnd"/>
+    </w:p>
+    <w:p>
+      <w:pPr>
+        <w:shd w:val="clear" w:color="auto" w:fill="F2F2F2" w:themeFill="background1" w:themeFillShade="F2"/>
+        <w:spacing w:line="240" w:lineRule="auto"/>
+        <w:rPr>
+          <w:lang w:val="en-US"/>
+        </w:rPr>
+      </w:pPr>
+      <w:r>
+        <w:rPr>
+          <w:lang w:val="en-US"/>
+        </w:rPr>
+        <w:t>}</w:t>
+      </w:r>
+    </w:p>
+    <w:p>
+      <w:pPr>
+        <w:shd w:val="clear" w:color="auto" w:fill="F2F2F2" w:themeFill="background1" w:themeFillShade="F2"/>
+        <w:spacing w:line="240" w:lineRule="auto"/>
+        <w:rPr>
+          <w:lang w:val="en-US"/>
+        </w:rPr>
+      </w:pPr>
+      <w:r>
+        <w:rPr>
+          <w:lang w:val="en-US"/>
+        </w:rPr>
+        <w:t>EQ118 = EQ</w:t>
+      </w:r>
+      <w:proofErr w:type="gramStart"/>
+      <w:r>
+        <w:rPr>
+          <w:lang w:val="en-US"/>
+        </w:rPr>
+        <w:t>119  /</w:t>
+      </w:r>
+      <w:proofErr w:type="gramEnd"/>
+      <w:r>
+        <w:rPr>
+          <w:lang w:val="en-US"/>
+        </w:rPr>
+        <w:t xml:space="preserve"> 10 ;</w:t>
+      </w:r>
+    </w:p>
+    <w:p>
+      <w:pPr>
+        <w:shd w:val="clear" w:color="auto" w:fill="F2F2F2" w:themeFill="background1" w:themeFillShade="F2"/>
+        <w:spacing w:line="240" w:lineRule="auto"/>
+        <w:rPr>
+          <w:lang w:val="en-US"/>
+        </w:rPr>
+      </w:pPr>
+    </w:p>
+    <w:p>
+      <w:pPr>
+        <w:shd w:val="clear" w:color="auto" w:fill="F2F2F2" w:themeFill="background1" w:themeFillShade="F2"/>
+        <w:spacing w:line="240" w:lineRule="auto"/>
+        <w:rPr>
+          <w:lang w:val="en-US"/>
+        </w:rPr>
+      </w:pPr>
+    </w:p>
+    <w:p>
+      <w:pPr>
+        <w:shd w:val="clear" w:color="auto" w:fill="F2F2F2" w:themeFill="background1" w:themeFillShade="F2"/>
+        <w:spacing w:line="240" w:lineRule="auto"/>
+        <w:rPr>
+          <w:lang w:val="en-US"/>
+        </w:rPr>
+      </w:pPr>
+      <w:r>
+        <w:rPr>
+          <w:lang w:val="en-US"/>
+        </w:rPr>
+        <w:t xml:space="preserve">EQ112 = </w:t>
+      </w:r>
+      <w:proofErr w:type="gramStart"/>
+      <w:r>
+        <w:rPr>
+          <w:lang w:val="en-US"/>
+        </w:rPr>
+        <w:t>34;</w:t>
+      </w:r>
+      <w:proofErr w:type="gramEnd"/>
+    </w:p>
+    <w:p>
+      <w:pPr>
+        <w:shd w:val="clear" w:color="auto" w:fill="F2F2F2" w:themeFill="background1" w:themeFillShade="F2"/>
+        <w:spacing w:line="240" w:lineRule="auto"/>
+        <w:rPr>
+          <w:lang w:val="en-US"/>
+        </w:rPr>
+      </w:pPr>
+      <w:r>
+        <w:rPr>
+          <w:lang w:val="en-US"/>
+        </w:rPr>
+        <w:t xml:space="preserve">EQ113 = </w:t>
+      </w:r>
+      <w:proofErr w:type="gramStart"/>
+      <w:r>
+        <w:rPr>
+          <w:lang w:val="en-US"/>
+        </w:rPr>
+        <w:t>12;</w:t>
+      </w:r>
+      <w:proofErr w:type="gramEnd"/>
+    </w:p>
+    <w:p>
+      <w:pPr>
+        <w:shd w:val="clear" w:color="auto" w:fill="F2F2F2" w:themeFill="background1" w:themeFillShade="F2"/>
+        <w:spacing w:line="240" w:lineRule="auto"/>
+        <w:rPr>
+          <w:lang w:val="en-US"/>
+        </w:rPr>
+      </w:pPr>
+      <w:r>
+        <w:rPr>
+          <w:lang w:val="en-US"/>
+        </w:rPr>
+        <w:t xml:space="preserve">for </w:t>
+      </w:r>
+      <w:proofErr w:type="gramStart"/>
+      <w:r>
+        <w:rPr>
+          <w:lang w:val="en-US"/>
+        </w:rPr>
+        <w:t>( EQ</w:t>
+      </w:r>
+      <w:proofErr w:type="gramEnd"/>
+      <w:r>
+        <w:rPr>
+          <w:lang w:val="en-US"/>
+        </w:rPr>
+        <w:t>111 = 1; EQ111&gt;10 &amp;&amp; EQ111&lt;15; EQ111 = EQ111 + 1;)</w:t>
+      </w:r>
+    </w:p>
+    <w:p>
+      <w:pPr>
+        <w:shd w:val="clear" w:color="auto" w:fill="F2F2F2" w:themeFill="background1" w:themeFillShade="F2"/>
+        <w:spacing w:line="240" w:lineRule="auto"/>
+        <w:rPr>
+          <w:lang w:val="en-US"/>
+        </w:rPr>
+      </w:pPr>
+      <w:r>
+        <w:rPr>
+          <w:lang w:val="en-US"/>
+        </w:rPr>
+        <w:t>{</w:t>
+      </w:r>
+    </w:p>
+    <w:p>
+      <w:pPr>
+        <w:shd w:val="clear" w:color="auto" w:fill="F2F2F2" w:themeFill="background1" w:themeFillShade="F2"/>
+        <w:spacing w:line="240" w:lineRule="auto"/>
+        <w:rPr>
+          <w:lang w:val="en-US"/>
+        </w:rPr>
+      </w:pPr>
+      <w:r>
+        <w:rPr>
+          <w:lang w:val="en-US"/>
+        </w:rPr>
+        <w:t xml:space="preserve">EQ117 = "EQ112" - 12 * </w:t>
+      </w:r>
+      <w:proofErr w:type="gramStart"/>
+      <w:r>
+        <w:rPr>
+          <w:lang w:val="en-US"/>
+        </w:rPr>
+        <w:t>10;</w:t>
+      </w:r>
+      <w:proofErr w:type="gramEnd"/>
+    </w:p>
+    <w:p>
+      <w:pPr>
+        <w:shd w:val="clear" w:color="auto" w:fill="F2F2F2" w:themeFill="background1" w:themeFillShade="F2"/>
+        <w:spacing w:line="240" w:lineRule="auto"/>
+        <w:rPr>
+          <w:lang w:val="en-US"/>
+        </w:rPr>
+      </w:pPr>
+      <w:r>
+        <w:rPr>
+          <w:lang w:val="en-US"/>
+        </w:rPr>
+        <w:t xml:space="preserve">EQ117 = 100 + 12 / </w:t>
+      </w:r>
+      <w:proofErr w:type="gramStart"/>
+      <w:r>
+        <w:rPr>
+          <w:lang w:val="en-US"/>
+        </w:rPr>
+        <w:t>10;</w:t>
+      </w:r>
+      <w:proofErr w:type="gramEnd"/>
+    </w:p>
+    <w:p>
+      <w:pPr>
+        <w:shd w:val="clear" w:color="auto" w:fill="F2F2F2" w:themeFill="background1" w:themeFillShade="F2"/>
+        <w:spacing w:line="240" w:lineRule="auto"/>
+        <w:rPr>
+          <w:lang w:val="en-US"/>
+        </w:rPr>
+      </w:pPr>
+      <w:r>
+        <w:rPr>
+          <w:lang w:val="en-US"/>
+        </w:rPr>
+        <w:t>}</w:t>
+      </w:r>
+    </w:p>
+    <w:p>
+      <w:pPr>
+        <w:shd w:val="clear" w:color="auto" w:fill="F2F2F2" w:themeFill="background1" w:themeFillShade="F2"/>
+        <w:spacing w:line="240" w:lineRule="auto"/>
+        <w:rPr>
+          <w:lang w:val="en-US"/>
+        </w:rPr>
+      </w:pPr>
+      <w:r>
+        <w:rPr>
+          <w:lang w:val="en-US"/>
+        </w:rPr>
+        <w:t xml:space="preserve">EQ119 </w:t>
+      </w:r>
+      <w:proofErr w:type="gramStart"/>
+      <w:r>
+        <w:rPr>
+          <w:lang w:val="en-US"/>
+        </w:rPr>
+        <w:t>=  EQ</w:t>
+      </w:r>
+      <w:proofErr w:type="gramEnd"/>
+      <w:r>
+        <w:rPr>
+          <w:lang w:val="en-US"/>
+        </w:rPr>
+        <w:t xml:space="preserve">113 - 15;  </w:t>
+      </w:r>
+    </w:p>
+    <w:p>
+      <w:pPr>
+        <w:shd w:val="clear" w:color="auto" w:fill="F2F2F2" w:themeFill="background1" w:themeFillShade="F2"/>
+        <w:spacing w:line="240" w:lineRule="auto"/>
+        <w:rPr>
+          <w:lang w:val="en-US"/>
+        </w:rPr>
+      </w:pPr>
+    </w:p>
+    <w:p>
+      <w:pPr>
+        <w:shd w:val="clear" w:color="auto" w:fill="F2F2F2" w:themeFill="background1" w:themeFillShade="F2"/>
+        <w:spacing w:line="240" w:lineRule="auto"/>
+        <w:rPr>
+          <w:lang w:val="en-US"/>
+        </w:rPr>
+      </w:pPr>
+    </w:p>
+    <w:p>
+      <w:pPr>
+        <w:shd w:val="clear" w:color="auto" w:fill="F2F2F2" w:themeFill="background1" w:themeFillShade="F2"/>
+        <w:spacing w:line="240" w:lineRule="auto"/>
+        <w:rPr>
+          <w:lang w:val="en-US"/>
+        </w:rPr>
+      </w:pPr>
+    </w:p>
+    <w:p>
+      <w:pPr>
+        <w:shd w:val="clear" w:color="auto" w:fill="F2F2F2" w:themeFill="background1" w:themeFillShade="F2"/>
+        <w:spacing w:line="240" w:lineRule="auto"/>
+        <w:rPr>
+          <w:lang w:val="en-US"/>
+        </w:rPr>
+      </w:pPr>
+    </w:p>
+    <w:p>
+      <w:pPr>
+        <w:shd w:val="clear" w:color="auto" w:fill="F2F2F2" w:themeFill="background1" w:themeFillShade="F2"/>
+        <w:spacing w:line="240" w:lineRule="auto"/>
+        <w:rPr>
+          <w:lang w:val="en-US"/>
+        </w:rPr>
+      </w:pPr>
+      <w:r>
+        <w:rPr>
+          <w:lang w:val="en-US"/>
+        </w:rPr>
+        <w:t xml:space="preserve">EQ112 = </w:t>
+      </w:r>
+      <w:proofErr w:type="gramStart"/>
+      <w:r>
+        <w:rPr>
+          <w:lang w:val="en-US"/>
+        </w:rPr>
+        <w:t>10;</w:t>
+      </w:r>
+      <w:proofErr w:type="gramEnd"/>
+    </w:p>
+    <w:p>
+      <w:pPr>
+        <w:shd w:val="clear" w:color="auto" w:fill="F2F2F2" w:themeFill="background1" w:themeFillShade="F2"/>
+        <w:spacing w:line="240" w:lineRule="auto"/>
+        <w:rPr>
+          <w:lang w:val="en-US"/>
+        </w:rPr>
+      </w:pPr>
+      <w:r>
+        <w:rPr>
+          <w:lang w:val="en-US"/>
+        </w:rPr>
+        <w:t xml:space="preserve">for </w:t>
+      </w:r>
+      <w:proofErr w:type="gramStart"/>
+      <w:r>
+        <w:rPr>
+          <w:lang w:val="en-US"/>
+        </w:rPr>
+        <w:t>( EQ</w:t>
+      </w:r>
+      <w:proofErr w:type="gramEnd"/>
+      <w:r>
+        <w:rPr>
+          <w:lang w:val="en-US"/>
+        </w:rPr>
+        <w:t>111 = 1; EQ111&gt;10 &amp;&amp; EQ111&lt;12;  EQ111 = EQ111 + 1;)</w:t>
+      </w:r>
+    </w:p>
+    <w:p>
+      <w:pPr>
+        <w:shd w:val="clear" w:color="auto" w:fill="F2F2F2" w:themeFill="background1" w:themeFillShade="F2"/>
+        <w:spacing w:line="240" w:lineRule="auto"/>
+        <w:rPr>
+          <w:lang w:val="en-US"/>
+        </w:rPr>
+      </w:pPr>
+      <w:r>
+        <w:rPr>
+          <w:lang w:val="en-US"/>
+        </w:rPr>
+        <w:t>{</w:t>
+      </w:r>
+    </w:p>
+    <w:p>
+      <w:pPr>
+        <w:shd w:val="clear" w:color="auto" w:fill="F2F2F2" w:themeFill="background1" w:themeFillShade="F2"/>
+        <w:spacing w:line="240" w:lineRule="auto"/>
+        <w:rPr>
+          <w:lang w:val="en-US"/>
+        </w:rPr>
+      </w:pPr>
+      <w:r>
+        <w:rPr>
+          <w:lang w:val="en-US"/>
+        </w:rPr>
+        <w:t xml:space="preserve">EQ117 = EQ112 - 12 * </w:t>
+      </w:r>
+      <w:proofErr w:type="gramStart"/>
+      <w:r>
+        <w:rPr>
+          <w:lang w:val="en-US"/>
+        </w:rPr>
+        <w:t>10;</w:t>
+      </w:r>
+      <w:proofErr w:type="gramEnd"/>
+    </w:p>
+    <w:p>
+      <w:pPr>
+        <w:shd w:val="clear" w:color="auto" w:fill="F2F2F2" w:themeFill="background1" w:themeFillShade="F2"/>
+        <w:spacing w:line="240" w:lineRule="auto"/>
+        <w:rPr>
+          <w:lang w:val="en-US"/>
+        </w:rPr>
+      </w:pPr>
+      <w:r>
+        <w:rPr>
+          <w:lang w:val="en-US"/>
+        </w:rPr>
+        <w:t xml:space="preserve">EQ110 = 100 - 12 / </w:t>
+      </w:r>
+      <w:proofErr w:type="gramStart"/>
+      <w:r>
+        <w:rPr>
+          <w:lang w:val="en-US"/>
+        </w:rPr>
+        <w:t>10;</w:t>
+      </w:r>
+      <w:proofErr w:type="gramEnd"/>
+    </w:p>
+    <w:p>
+      <w:pPr>
+        <w:shd w:val="clear" w:color="auto" w:fill="F2F2F2" w:themeFill="background1" w:themeFillShade="F2"/>
+        <w:spacing w:line="240" w:lineRule="auto"/>
+        <w:rPr>
+          <w:lang w:val="en-US"/>
+        </w:rPr>
+      </w:pPr>
+      <w:r>
+        <w:rPr>
+          <w:lang w:val="en-US"/>
+        </w:rPr>
+        <w:t>}</w:t>
+      </w:r>
+    </w:p>
+    <w:p>
+      <w:pPr>
+        <w:shd w:val="clear" w:color="auto" w:fill="F2F2F2" w:themeFill="background1" w:themeFillShade="F2"/>
+        <w:spacing w:line="240" w:lineRule="auto"/>
+        <w:rPr>
+          <w:lang w:val="en-US"/>
+        </w:rPr>
+      </w:pPr>
+      <w:r>
+        <w:rPr>
+          <w:lang w:val="en-US"/>
+        </w:rPr>
+        <w:t>EQ118 = EQ</w:t>
+      </w:r>
+      <w:proofErr w:type="gramStart"/>
+      <w:r>
+        <w:rPr>
+          <w:lang w:val="en-US"/>
+        </w:rPr>
+        <w:t>117  /</w:t>
+      </w:r>
+      <w:proofErr w:type="gramEnd"/>
+      <w:r>
+        <w:rPr>
+          <w:lang w:val="en-US"/>
+        </w:rPr>
+        <w:t xml:space="preserve"> 10 ;</w:t>
+      </w:r>
+    </w:p>
+    <w:p>
+      <w:pPr>
+        <w:shd w:val="clear" w:color="auto" w:fill="F2F2F2" w:themeFill="background1" w:themeFillShade="F2"/>
+        <w:spacing w:line="240" w:lineRule="auto"/>
+        <w:rPr>
+          <w:lang w:val="en-US"/>
+        </w:rPr>
+      </w:pPr>
+    </w:p>
+    <w:p>
+      <w:pPr>
+        <w:shd w:val="clear" w:color="auto" w:fill="F2F2F2" w:themeFill="background1" w:themeFillShade="F2"/>
+        <w:spacing w:line="240" w:lineRule="auto"/>
+        <w:rPr>
+          <w:lang w:val="en-US"/>
+        </w:rPr>
+      </w:pPr>
+    </w:p>
+    <w:p>
+      <w:pPr>
+        <w:shd w:val="clear" w:color="auto" w:fill="F2F2F2" w:themeFill="background1" w:themeFillShade="F2"/>
+        <w:spacing w:line="240" w:lineRule="auto"/>
+        <w:rPr>
+          <w:lang w:val="en-US"/>
+        </w:rPr>
+      </w:pPr>
+    </w:p>
+    <w:p>
+      <w:pPr>
+        <w:shd w:val="clear" w:color="auto" w:fill="F2F2F2" w:themeFill="background1" w:themeFillShade="F2"/>
+        <w:spacing w:line="240" w:lineRule="auto"/>
+        <w:rPr>
+          <w:lang w:val="en-US"/>
+        </w:rPr>
+      </w:pPr>
+    </w:p>
+    <w:p>
+      <w:pPr>
+        <w:shd w:val="clear" w:color="auto" w:fill="F2F2F2" w:themeFill="background1" w:themeFillShade="F2"/>
+        <w:spacing w:line="240" w:lineRule="auto"/>
+        <w:rPr>
+          <w:lang w:val="en-US"/>
+        </w:rPr>
+      </w:pPr>
+    </w:p>
+    <w:p>
+      <w:pPr>
+        <w:shd w:val="clear" w:color="auto" w:fill="F2F2F2" w:themeFill="background1" w:themeFillShade="F2"/>
+        <w:spacing w:line="240" w:lineRule="auto"/>
+        <w:rPr>
+          <w:lang w:val="en-US"/>
+        </w:rPr>
+      </w:pPr>
+      <w:r>
+        <w:rPr>
+          <w:lang w:val="en-US"/>
+        </w:rPr>
+        <w:t xml:space="preserve">EQ112 = </w:t>
+      </w:r>
+      <w:proofErr w:type="gramStart"/>
+      <w:r>
+        <w:rPr>
+          <w:lang w:val="en-US"/>
+        </w:rPr>
+        <w:t>20;</w:t>
+      </w:r>
+      <w:proofErr w:type="gramEnd"/>
+    </w:p>
+    <w:p>
+      <w:pPr>
+        <w:shd w:val="clear" w:color="auto" w:fill="F2F2F2" w:themeFill="background1" w:themeFillShade="F2"/>
+        <w:spacing w:line="240" w:lineRule="auto"/>
+        <w:rPr>
+          <w:lang w:val="en-US"/>
+        </w:rPr>
+      </w:pPr>
+      <w:r>
+        <w:rPr>
+          <w:lang w:val="en-US"/>
+        </w:rPr>
+        <w:t xml:space="preserve">for </w:t>
+      </w:r>
+      <w:proofErr w:type="gramStart"/>
+      <w:r>
+        <w:rPr>
+          <w:lang w:val="en-US"/>
+        </w:rPr>
+        <w:t>( EQ</w:t>
+      </w:r>
+      <w:proofErr w:type="gramEnd"/>
+      <w:r>
+        <w:rPr>
+          <w:lang w:val="en-US"/>
+        </w:rPr>
+        <w:t>111 = 1; EQ111&gt;10 &amp;&amp; EQ111&lt;12;  EQ111 = EQ111 + 1;)</w:t>
+      </w:r>
+    </w:p>
+    <w:p>
+      <w:pPr>
+        <w:shd w:val="clear" w:color="auto" w:fill="F2F2F2" w:themeFill="background1" w:themeFillShade="F2"/>
+        <w:spacing w:line="240" w:lineRule="auto"/>
+        <w:rPr>
+          <w:lang w:val="en-US"/>
+        </w:rPr>
+      </w:pPr>
+      <w:r>
+        <w:rPr>
+          <w:lang w:val="en-US"/>
+        </w:rPr>
+        <w:t>{</w:t>
+      </w:r>
+    </w:p>
+    <w:p>
+      <w:pPr>
+        <w:shd w:val="clear" w:color="auto" w:fill="F2F2F2" w:themeFill="background1" w:themeFillShade="F2"/>
+        <w:spacing w:line="240" w:lineRule="auto"/>
+        <w:rPr>
+          <w:lang w:val="en-US"/>
+        </w:rPr>
+      </w:pPr>
+      <w:r>
+        <w:rPr>
+          <w:lang w:val="en-US"/>
+        </w:rPr>
+        <w:t xml:space="preserve">EQ117 = EQ112 - </w:t>
+      </w:r>
+      <w:proofErr w:type="gramStart"/>
+      <w:r>
+        <w:rPr>
+          <w:lang w:val="en-US"/>
+        </w:rPr>
+        <w:t>10;</w:t>
+      </w:r>
+      <w:proofErr w:type="gramEnd"/>
+    </w:p>
+    <w:p>
+      <w:pPr>
+        <w:shd w:val="clear" w:color="auto" w:fill="F2F2F2" w:themeFill="background1" w:themeFillShade="F2"/>
+        <w:spacing w:line="240" w:lineRule="auto"/>
+        <w:rPr>
+          <w:lang w:val="en-US"/>
+        </w:rPr>
+      </w:pPr>
+      <w:r>
+        <w:rPr>
+          <w:lang w:val="en-US"/>
+        </w:rPr>
+        <w:t xml:space="preserve">EQ110 = 100 + 12 / </w:t>
+      </w:r>
+      <w:proofErr w:type="gramStart"/>
+      <w:r>
+        <w:rPr>
+          <w:lang w:val="en-US"/>
+        </w:rPr>
+        <w:t>10;</w:t>
+      </w:r>
+      <w:proofErr w:type="gramEnd"/>
+    </w:p>
+    <w:p>
+      <w:pPr>
+        <w:shd w:val="clear" w:color="auto" w:fill="F2F2F2" w:themeFill="background1" w:themeFillShade="F2"/>
+        <w:spacing w:line="240" w:lineRule="auto"/>
+        <w:rPr>
+          <w:lang w:val="en-US"/>
+        </w:rPr>
+      </w:pPr>
+      <w:r>
+        <w:rPr>
+          <w:lang w:val="en-US"/>
+        </w:rPr>
+        <w:t>}</w:t>
+      </w:r>
+    </w:p>
+    <w:p>
+      <w:pPr>
+        <w:shd w:val="clear" w:color="auto" w:fill="F2F2F2" w:themeFill="background1" w:themeFillShade="F2"/>
+        <w:spacing w:line="240" w:lineRule="auto"/>
+        <w:rPr>
+          <w:lang w:val="en-US"/>
+        </w:rPr>
+      </w:pPr>
+      <w:r>
+        <w:rPr>
+          <w:lang w:val="en-US"/>
+        </w:rPr>
+        <w:t xml:space="preserve">EQ115 = </w:t>
+      </w:r>
+      <w:proofErr w:type="gramStart"/>
+      <w:r>
+        <w:rPr>
+          <w:lang w:val="en-US"/>
+        </w:rPr>
+        <w:t>3;</w:t>
+      </w:r>
+      <w:proofErr w:type="gramEnd"/>
+    </w:p>
+    <w:p>
+      <w:pPr>
+        <w:shd w:val="clear" w:color="auto" w:fill="F2F2F2" w:themeFill="background1" w:themeFillShade="F2"/>
+        <w:spacing w:line="240" w:lineRule="auto"/>
+        <w:rPr>
+          <w:lang w:val="en-US"/>
+        </w:rPr>
+      </w:pPr>
+    </w:p>
+    <w:p>
+      <w:pPr>
+        <w:shd w:val="clear" w:color="auto" w:fill="F2F2F2" w:themeFill="background1" w:themeFillShade="F2"/>
+        <w:spacing w:line="240" w:lineRule="auto"/>
+        <w:rPr>
+          <w:lang w:val="en-US"/>
+        </w:rPr>
+      </w:pPr>
+    </w:p>
+    <w:p>
+      <w:pPr>
+        <w:shd w:val="clear" w:color="auto" w:fill="F2F2F2" w:themeFill="background1" w:themeFillShade="F2"/>
+        <w:spacing w:line="240" w:lineRule="auto"/>
+        <w:rPr>
+          <w:lang w:val="en-US"/>
+        </w:rPr>
+      </w:pPr>
+      <w:r>
+        <w:rPr>
+          <w:lang w:val="en-US"/>
+        </w:rPr>
+        <w:t xml:space="preserve">EQ112 = </w:t>
+      </w:r>
+      <w:proofErr w:type="gramStart"/>
+      <w:r>
+        <w:rPr>
+          <w:lang w:val="en-US"/>
+        </w:rPr>
+        <w:t>20;</w:t>
+      </w:r>
+      <w:proofErr w:type="gramEnd"/>
+    </w:p>
+    <w:p>
+      <w:pPr>
+        <w:shd w:val="clear" w:color="auto" w:fill="F2F2F2" w:themeFill="background1" w:themeFillShade="F2"/>
+        <w:spacing w:line="240" w:lineRule="auto"/>
+        <w:rPr>
+          <w:lang w:val="en-US"/>
+        </w:rPr>
+      </w:pPr>
+      <w:r>
+        <w:rPr>
+          <w:lang w:val="en-US"/>
+        </w:rPr>
+        <w:t xml:space="preserve">EQ113 = </w:t>
+      </w:r>
+      <w:proofErr w:type="gramStart"/>
+      <w:r>
+        <w:rPr>
+          <w:lang w:val="en-US"/>
+        </w:rPr>
+        <w:t>EQ1190;</w:t>
+      </w:r>
+      <w:proofErr w:type="gramEnd"/>
+    </w:p>
+    <w:p>
+      <w:pPr>
+        <w:shd w:val="clear" w:color="auto" w:fill="F2F2F2" w:themeFill="background1" w:themeFillShade="F2"/>
+        <w:spacing w:line="240" w:lineRule="auto"/>
+        <w:rPr>
+          <w:lang w:val="en-US"/>
+        </w:rPr>
+      </w:pPr>
+      <w:r>
+        <w:rPr>
+          <w:lang w:val="en-US"/>
+        </w:rPr>
+        <w:t xml:space="preserve">for </w:t>
+      </w:r>
+      <w:proofErr w:type="gramStart"/>
+      <w:r>
+        <w:rPr>
+          <w:lang w:val="en-US"/>
+        </w:rPr>
+        <w:t>( EQ</w:t>
+      </w:r>
+      <w:proofErr w:type="gramEnd"/>
+      <w:r>
+        <w:rPr>
+          <w:lang w:val="en-US"/>
+        </w:rPr>
+        <w:t>111 = 1; EQ111&gt;10 &amp;&amp; EQ111&lt;12;  EQ111 = EQ111 + 1;)</w:t>
+      </w:r>
+    </w:p>
+    <w:p>
+      <w:pPr>
+        <w:shd w:val="clear" w:color="auto" w:fill="F2F2F2" w:themeFill="background1" w:themeFillShade="F2"/>
+        <w:spacing w:line="240" w:lineRule="auto"/>
+        <w:rPr>
+          <w:lang w:val="en-US"/>
+        </w:rPr>
+      </w:pPr>
+      <w:r>
+        <w:rPr>
+          <w:lang w:val="en-US"/>
+        </w:rPr>
+        <w:t>{</w:t>
+      </w:r>
+    </w:p>
+    <w:p>
+      <w:pPr>
+        <w:shd w:val="clear" w:color="auto" w:fill="F2F2F2" w:themeFill="background1" w:themeFillShade="F2"/>
+        <w:spacing w:line="240" w:lineRule="auto"/>
+        <w:rPr>
+          <w:lang w:val="en-US"/>
+        </w:rPr>
+      </w:pPr>
+      <w:r>
+        <w:rPr>
+          <w:lang w:val="en-US"/>
+        </w:rPr>
+        <w:t xml:space="preserve">EQ117 = "EQ112" - </w:t>
+      </w:r>
+      <w:proofErr w:type="gramStart"/>
+      <w:r>
+        <w:rPr>
+          <w:lang w:val="en-US"/>
+        </w:rPr>
+        <w:t>10;</w:t>
+      </w:r>
+      <w:proofErr w:type="gramEnd"/>
+    </w:p>
+    <w:p>
+      <w:pPr>
+        <w:shd w:val="clear" w:color="auto" w:fill="F2F2F2" w:themeFill="background1" w:themeFillShade="F2"/>
+        <w:spacing w:line="240" w:lineRule="auto"/>
+        <w:rPr>
+          <w:lang w:val="en-US"/>
+        </w:rPr>
+      </w:pPr>
+      <w:r>
+        <w:rPr>
+          <w:lang w:val="en-US"/>
+        </w:rPr>
+        <w:t xml:space="preserve">EQ110 = 100 + 12 / </w:t>
+      </w:r>
+      <w:proofErr w:type="gramStart"/>
+      <w:r>
+        <w:rPr>
+          <w:lang w:val="en-US"/>
+        </w:rPr>
+        <w:t>10;</w:t>
+      </w:r>
+      <w:proofErr w:type="gramEnd"/>
+    </w:p>
+    <w:p>
+      <w:pPr>
+        <w:shd w:val="clear" w:color="auto" w:fill="F2F2F2" w:themeFill="background1" w:themeFillShade="F2"/>
+        <w:spacing w:line="240" w:lineRule="auto"/>
+        <w:rPr>
+          <w:lang w:val="en-US"/>
+        </w:rPr>
+      </w:pPr>
+      <w:r>
+        <w:rPr>
+          <w:lang w:val="en-US"/>
+        </w:rPr>
+        <w:t>}</w:t>
+      </w:r>
+    </w:p>
+    <w:p>
+      <w:pPr>
+        <w:shd w:val="clear" w:color="auto" w:fill="F2F2F2" w:themeFill="background1" w:themeFillShade="F2"/>
+        <w:spacing w:line="240" w:lineRule="auto"/>
+        <w:rPr>
+          <w:lang w:val="en-US"/>
+        </w:rPr>
+      </w:pPr>
+      <w:r>
+        <w:rPr>
+          <w:lang w:val="en-US"/>
+        </w:rPr>
+        <w:t xml:space="preserve">EQ115 = </w:t>
+      </w:r>
+      <w:proofErr w:type="gramStart"/>
+      <w:r>
+        <w:rPr>
+          <w:lang w:val="en-US"/>
+        </w:rPr>
+        <w:t>3;</w:t>
+      </w:r>
+      <w:proofErr w:type="gramEnd"/>
+    </w:p>
+    <w:p>
+      <w:pPr>
+        <w:shd w:val="clear" w:color="auto" w:fill="F2F2F2" w:themeFill="background1" w:themeFillShade="F2"/>
+        <w:spacing w:line="240" w:lineRule="auto"/>
+        <w:rPr>
+          <w:lang w:val="en-US"/>
+        </w:rPr>
+      </w:pPr>
+    </w:p>
+    <w:p>
+      <w:pPr>
+        <w:shd w:val="clear" w:color="auto" w:fill="F2F2F2" w:themeFill="background1" w:themeFillShade="F2"/>
+        <w:spacing w:line="240" w:lineRule="auto"/>
+        <w:rPr>
+          <w:lang w:val="en-US"/>
+        </w:rPr>
+      </w:pPr>
+      <w:r>
+        <w:rPr>
+          <w:lang w:val="en-US"/>
+        </w:rPr>
+        <w:t xml:space="preserve">EQ112 = </w:t>
+      </w:r>
+      <w:proofErr w:type="gramStart"/>
+      <w:r>
+        <w:rPr>
+          <w:lang w:val="en-US"/>
+        </w:rPr>
+        <w:t>20;</w:t>
+      </w:r>
+      <w:proofErr w:type="gramEnd"/>
+    </w:p>
+    <w:p>
+      <w:pPr>
+        <w:shd w:val="clear" w:color="auto" w:fill="F2F2F2" w:themeFill="background1" w:themeFillShade="F2"/>
+        <w:spacing w:line="240" w:lineRule="auto"/>
+        <w:rPr>
+          <w:lang w:val="en-US"/>
+        </w:rPr>
+      </w:pPr>
+      <w:r>
+        <w:rPr>
+          <w:lang w:val="en-US"/>
+        </w:rPr>
+        <w:t xml:space="preserve">for </w:t>
+      </w:r>
+      <w:proofErr w:type="gramStart"/>
+      <w:r>
+        <w:rPr>
+          <w:lang w:val="en-US"/>
+        </w:rPr>
+        <w:t>( EQ</w:t>
+      </w:r>
+      <w:proofErr w:type="gramEnd"/>
+      <w:r>
+        <w:rPr>
+          <w:lang w:val="en-US"/>
+        </w:rPr>
+        <w:t>111 = 1; EQ111&gt;10 &amp;&amp; EQ111&lt;12;  EQ111 = EQ111 + 1;)</w:t>
+      </w:r>
+    </w:p>
+    <w:p>
+      <w:pPr>
+        <w:shd w:val="clear" w:color="auto" w:fill="F2F2F2" w:themeFill="background1" w:themeFillShade="F2"/>
+        <w:spacing w:line="240" w:lineRule="auto"/>
+        <w:rPr>
+          <w:lang w:val="en-US"/>
+        </w:rPr>
+      </w:pPr>
+      <w:r>
+        <w:rPr>
+          <w:lang w:val="en-US"/>
+        </w:rPr>
+        <w:t>{</w:t>
+      </w:r>
+    </w:p>
+    <w:p>
+      <w:pPr>
+        <w:shd w:val="clear" w:color="auto" w:fill="F2F2F2" w:themeFill="background1" w:themeFillShade="F2"/>
+        <w:spacing w:line="240" w:lineRule="auto"/>
+        <w:rPr>
+          <w:lang w:val="en-US"/>
+        </w:rPr>
+      </w:pPr>
+      <w:r>
+        <w:rPr>
+          <w:lang w:val="en-US"/>
+        </w:rPr>
+        <w:t xml:space="preserve">EQ117 = EQ112 - </w:t>
+      </w:r>
+      <w:proofErr w:type="gramStart"/>
+      <w:r>
+        <w:rPr>
+          <w:lang w:val="en-US"/>
+        </w:rPr>
+        <w:t>10;</w:t>
+      </w:r>
+      <w:proofErr w:type="gramEnd"/>
+    </w:p>
+    <w:p>
+      <w:pPr>
+        <w:shd w:val="clear" w:color="auto" w:fill="F2F2F2" w:themeFill="background1" w:themeFillShade="F2"/>
+        <w:spacing w:line="240" w:lineRule="auto"/>
+        <w:rPr>
+          <w:lang w:val="en-US"/>
+        </w:rPr>
+      </w:pPr>
+      <w:r>
+        <w:rPr>
+          <w:lang w:val="en-US"/>
+        </w:rPr>
+        <w:t xml:space="preserve">EQ110 = 100 * 12 + </w:t>
+      </w:r>
+      <w:proofErr w:type="gramStart"/>
+      <w:r>
+        <w:rPr>
+          <w:lang w:val="en-US"/>
+        </w:rPr>
+        <w:t>10;</w:t>
+      </w:r>
+      <w:proofErr w:type="gramEnd"/>
+    </w:p>
+    <w:p>
+      <w:pPr>
+        <w:shd w:val="clear" w:color="auto" w:fill="F2F2F2" w:themeFill="background1" w:themeFillShade="F2"/>
+        <w:spacing w:line="240" w:lineRule="auto"/>
+        <w:rPr>
+          <w:lang w:val="en-US"/>
+        </w:rPr>
+      </w:pPr>
+      <w:r>
+        <w:rPr>
+          <w:lang w:val="en-US"/>
+        </w:rPr>
+        <w:t>}</w:t>
+      </w:r>
+    </w:p>
+    <w:p>
+      <w:pPr>
+        <w:shd w:val="clear" w:color="auto" w:fill="F2F2F2" w:themeFill="background1" w:themeFillShade="F2"/>
+        <w:spacing w:line="240" w:lineRule="auto"/>
+        <w:rPr>
+          <w:lang w:val="en-US"/>
+        </w:rPr>
+      </w:pPr>
+      <w:r>
+        <w:rPr>
+          <w:lang w:val="en-US"/>
+        </w:rPr>
+        <w:t xml:space="preserve">EQ115 = </w:t>
+      </w:r>
+      <w:proofErr w:type="gramStart"/>
+      <w:r>
+        <w:rPr>
+          <w:lang w:val="en-US"/>
+        </w:rPr>
+        <w:t>3;</w:t>
+      </w:r>
+      <w:proofErr w:type="gramEnd"/>
+    </w:p>
+    <w:p>
+      <w:pPr>
+        <w:shd w:val="clear" w:color="auto" w:fill="F2F2F2" w:themeFill="background1" w:themeFillShade="F2"/>
+        <w:spacing w:line="240" w:lineRule="auto"/>
+        <w:rPr>
+          <w:lang w:val="en-US"/>
+        </w:rPr>
+      </w:pPr>
+    </w:p>
+    <w:p>
+      <w:pPr>
+        <w:shd w:val="clear" w:color="auto" w:fill="FFFFFF" w:themeFill="background1"/>
+        <w:spacing w:line="240" w:lineRule="auto"/>
+        <w:rPr>
+          <w:lang w:val="en-US"/>
+        </w:rPr>
+      </w:pPr>
+    </w:p>
+    <w:p>
+      <w:pPr>
+        <w:shd w:val="clear" w:color="auto" w:fill="FFFFFF" w:themeFill="background1"/>
+        <w:spacing w:line="240" w:lineRule="auto"/>
+        <w:rPr>
+          <w:lang w:val="en-US"/>
+        </w:rPr>
+      </w:pPr>
+    </w:p>
+    <w:p>
+      <w:pPr>
+        <w:shd w:val="clear" w:color="auto" w:fill="F2F2F2" w:themeFill="background1" w:themeFillShade="F2"/>
+        <w:spacing w:line="240" w:lineRule="auto"/>
+        <w:rPr>
+          <w:lang w:val="en-US"/>
+        </w:rPr>
+      </w:pPr>
+      <w:r>
+        <w:rPr>
+          <w:lang w:val="en-US"/>
+        </w:rPr>
+        <w:lastRenderedPageBreak/>
+        <w:t xml:space="preserve">EQ112 = </w:t>
+      </w:r>
+      <w:proofErr w:type="gramStart"/>
+      <w:r>
+        <w:rPr>
+          <w:lang w:val="en-US"/>
+        </w:rPr>
+        <w:t>10;</w:t>
+      </w:r>
+      <w:proofErr w:type="gramEnd"/>
+    </w:p>
+    <w:p>
+      <w:pPr>
+        <w:shd w:val="clear" w:color="auto" w:fill="F2F2F2" w:themeFill="background1" w:themeFillShade="F2"/>
+        <w:spacing w:line="240" w:lineRule="auto"/>
+        <w:rPr>
+          <w:lang w:val="en-US"/>
+        </w:rPr>
+      </w:pPr>
+      <w:r>
+        <w:rPr>
+          <w:lang w:val="en-US"/>
+        </w:rPr>
+        <w:t xml:space="preserve">for </w:t>
+      </w:r>
+      <w:proofErr w:type="gramStart"/>
+      <w:r>
+        <w:rPr>
+          <w:lang w:val="en-US"/>
+        </w:rPr>
+        <w:t>( EQ</w:t>
+      </w:r>
+      <w:proofErr w:type="gramEnd"/>
+      <w:r>
+        <w:rPr>
+          <w:lang w:val="en-US"/>
+        </w:rPr>
+        <w:t>111 = 1; EQ111&gt;10 &amp;&amp; EQ111&lt;12;  EQ111 = EQ111 + 1;)</w:t>
+      </w:r>
+    </w:p>
+    <w:p>
+      <w:pPr>
+        <w:shd w:val="clear" w:color="auto" w:fill="F2F2F2" w:themeFill="background1" w:themeFillShade="F2"/>
+        <w:spacing w:line="240" w:lineRule="auto"/>
+        <w:rPr>
+          <w:lang w:val="en-US"/>
+        </w:rPr>
+      </w:pPr>
+      <w:r>
+        <w:rPr>
+          <w:lang w:val="en-US"/>
+        </w:rPr>
+        <w:t>{</w:t>
+      </w:r>
+    </w:p>
+    <w:p>
+      <w:pPr>
+        <w:shd w:val="clear" w:color="auto" w:fill="F2F2F2" w:themeFill="background1" w:themeFillShade="F2"/>
+        <w:spacing w:line="240" w:lineRule="auto"/>
+        <w:rPr>
+          <w:lang w:val="en-US"/>
+        </w:rPr>
+      </w:pPr>
+      <w:r>
+        <w:rPr>
+          <w:lang w:val="en-US"/>
+        </w:rPr>
+        <w:t xml:space="preserve">EQ117 = EQ112 - </w:t>
+      </w:r>
+      <w:proofErr w:type="gramStart"/>
+      <w:r>
+        <w:rPr>
+          <w:lang w:val="en-US"/>
+        </w:rPr>
+        <w:t>10;</w:t>
+      </w:r>
+      <w:proofErr w:type="gramEnd"/>
+    </w:p>
+    <w:p>
+      <w:pPr>
+        <w:shd w:val="clear" w:color="auto" w:fill="F2F2F2" w:themeFill="background1" w:themeFillShade="F2"/>
+        <w:spacing w:line="240" w:lineRule="auto"/>
+        <w:rPr>
+          <w:lang w:val="en-US"/>
+        </w:rPr>
+      </w:pPr>
+      <w:r>
+        <w:rPr>
+          <w:lang w:val="en-US"/>
+        </w:rPr>
+        <w:t xml:space="preserve">EQ110 = 100 + 12 / </w:t>
+      </w:r>
+      <w:proofErr w:type="gramStart"/>
+      <w:r>
+        <w:rPr>
+          <w:lang w:val="en-US"/>
+        </w:rPr>
+        <w:t>10;</w:t>
+      </w:r>
+      <w:proofErr w:type="gramEnd"/>
+    </w:p>
+    <w:p>
+      <w:pPr>
+        <w:shd w:val="clear" w:color="auto" w:fill="F2F2F2" w:themeFill="background1" w:themeFillShade="F2"/>
+        <w:spacing w:line="240" w:lineRule="auto"/>
+        <w:rPr>
+          <w:lang w:val="en-US"/>
+        </w:rPr>
+      </w:pPr>
+      <w:r>
+        <w:rPr>
+          <w:lang w:val="en-US"/>
+        </w:rPr>
+        <w:t>}</w:t>
+      </w:r>
+    </w:p>
+    <w:p>
+      <w:pPr>
+        <w:shd w:val="clear" w:color="auto" w:fill="F2F2F2" w:themeFill="background1" w:themeFillShade="F2"/>
+        <w:spacing w:line="240" w:lineRule="auto"/>
+        <w:rPr>
+          <w:lang w:val="en-US"/>
+        </w:rPr>
+      </w:pPr>
+      <w:r>
+        <w:rPr>
+          <w:lang w:val="en-US"/>
+        </w:rPr>
+        <w:t xml:space="preserve">EQ115 = </w:t>
+      </w:r>
+      <w:proofErr w:type="gramStart"/>
+      <w:r>
+        <w:rPr>
+          <w:lang w:val="en-US"/>
+        </w:rPr>
+        <w:t>3;</w:t>
+      </w:r>
+      <w:proofErr w:type="gramEnd"/>
+    </w:p>
+    <w:p>
+      <w:pPr>
+        <w:shd w:val="clear" w:color="auto" w:fill="F2F2F2" w:themeFill="background1" w:themeFillShade="F2"/>
+        <w:spacing w:line="240" w:lineRule="auto"/>
+        <w:rPr>
+          <w:lang w:val="en-US"/>
+        </w:rPr>
+      </w:pPr>
     </w:p>
     <w:sectPr>
       <w:pgSz w:w="12240" w:h="15840"/>

</xml_diff>